<commit_message>
docs: add initial thesis chapters and update manuscript analysis and results
</commit_message>
<xml_diff>
--- a/thesis_docs/manuscripts/Chapter_1_Introduction.docx
+++ b/thesis_docs/manuscripts/Chapter_1_Introduction.docx
@@ -91,7 +91,7 @@
           <w:highlight w:val="yellow"/>
           <w14:ligatures w14:val="none"/>
         </w:rPr>
-        <w:t>While existing predictive models are increasingly used to forecast airport passenger flow management, the systemic shocks of the COVID-19 pandemic underscored limitations within traditional, accuracy-centric performance metrics to handle abrupt demand shocks, structural breaks, and changing operating constraints. These unprecedented operational disruptions demonstrated that conventional accuracy metrics, while necessary, are insufficient as the sole basis for evaluating models intended for volatile airport operating environments. Specifically, the pandemic revealed that a singular evaluation standard is inadequate across highly variable operational contexts, necessitating the assessment of predictive models through a broader, multidimensional set of performance measures. In airport operations, the most useful predictive model is therefore not necessarily the one with the lowest average forecast error, but the one that remains reliable during disruption</w:t>
+        <w:t xml:space="preserve">While existing predictive models are increasingly used to forecast airport passenger flow management, the systemic shocks of the COVID-19 pandemic underscored limitations within traditional, accuracy-centric performance metrics to handle abrupt demand shocks, structural breaks, and changing operating constraints. These unprecedented operational disruptions demonstrated that conventional accuracy metrics, while necessary, are insufficient as the sole basis for evaluating models intended for volatile airport operating environments. Specifically, the pandemic revealed that a singular evaluation standard is inadequate across highly variable operational contexts, necessitating the assessment of predictive models through a broader, multidimensional set of performance measures. In airport operations, the most useful predictive model is therefore not necessarily the one with the lowest average forecast error, but the one that remains reliable during disruption (robustness), recovers effectively as conditions evolve (resilience), and transfers across operational contexts (generalizability). This study examines the suitability of predictive models - specifically for forecasting TSA throughput - </w:t>
       </w:r>
       <w:r>
         <w:rPr>
@@ -101,97 +101,7 @@
           <w:highlight w:val="yellow"/>
           <w14:ligatures w14:val="none"/>
         </w:rPr>
-        <w:t xml:space="preserve"> (robustness)</w:t>
-      </w:r>
-      <w:r>
-        <w:rPr>
-          <w:rFonts w:ascii="Times New Roman" w:eastAsia="Times New Roman" w:hAnsi="Times New Roman" w:cs="Times New Roman"/>
-          <w:color w:val="000000"/>
-          <w:kern w:val="0"/>
-          <w:highlight w:val="yellow"/>
-          <w14:ligatures w14:val="none"/>
-        </w:rPr>
-        <w:t>, recovers effectively as conditions evolve</w:t>
-      </w:r>
-      <w:r>
-        <w:rPr>
-          <w:rFonts w:ascii="Times New Roman" w:eastAsia="Times New Roman" w:hAnsi="Times New Roman" w:cs="Times New Roman"/>
-          <w:color w:val="000000"/>
-          <w:kern w:val="0"/>
-          <w:highlight w:val="yellow"/>
-          <w14:ligatures w14:val="none"/>
-        </w:rPr>
-        <w:t xml:space="preserve"> (resilience)</w:t>
-      </w:r>
-      <w:r>
-        <w:rPr>
-          <w:rFonts w:ascii="Times New Roman" w:eastAsia="Times New Roman" w:hAnsi="Times New Roman" w:cs="Times New Roman"/>
-          <w:color w:val="000000"/>
-          <w:kern w:val="0"/>
-          <w:highlight w:val="yellow"/>
-          <w14:ligatures w14:val="none"/>
-        </w:rPr>
-        <w:t>, and transfers across operational contexts</w:t>
-      </w:r>
-      <w:r>
-        <w:rPr>
-          <w:rFonts w:ascii="Times New Roman" w:eastAsia="Times New Roman" w:hAnsi="Times New Roman" w:cs="Times New Roman"/>
-          <w:color w:val="000000"/>
-          <w:kern w:val="0"/>
-          <w:highlight w:val="yellow"/>
-          <w14:ligatures w14:val="none"/>
-        </w:rPr>
-        <w:t xml:space="preserve"> (generalizability)</w:t>
-      </w:r>
-      <w:r>
-        <w:rPr>
-          <w:rFonts w:ascii="Times New Roman" w:eastAsia="Times New Roman" w:hAnsi="Times New Roman" w:cs="Times New Roman"/>
-          <w:color w:val="000000"/>
-          <w:kern w:val="0"/>
-          <w:highlight w:val="yellow"/>
-          <w14:ligatures w14:val="none"/>
-        </w:rPr>
-        <w:t xml:space="preserve">. This study examines the suitability of predictive models - specifically for forecasting TSA throughput - </w:t>
-      </w:r>
-      <w:r>
-        <w:rPr>
-          <w:rFonts w:ascii="Times New Roman" w:eastAsia="Times New Roman" w:hAnsi="Times New Roman" w:cs="Times New Roman"/>
-          <w:color w:val="000000"/>
-          <w:kern w:val="0"/>
-          <w:highlight w:val="yellow"/>
-          <w14:ligatures w14:val="none"/>
-        </w:rPr>
-        <w:t>across routine, traditional</w:t>
-      </w:r>
-      <w:r>
-        <w:rPr>
-          <w:rFonts w:ascii="Times New Roman" w:eastAsia="Times New Roman" w:hAnsi="Times New Roman" w:cs="Times New Roman"/>
-          <w:color w:val="000000"/>
-          <w:kern w:val="0"/>
-          <w:highlight w:val="yellow"/>
-          <w14:ligatures w14:val="none"/>
-        </w:rPr>
-        <w:t>,</w:t>
-      </w:r>
-      <w:r>
-        <w:rPr>
-          <w:rFonts w:ascii="Times New Roman" w:eastAsia="Times New Roman" w:hAnsi="Times New Roman" w:cs="Times New Roman"/>
-          <w:color w:val="000000"/>
-          <w:kern w:val="0"/>
-          <w:highlight w:val="yellow"/>
-          <w14:ligatures w14:val="none"/>
-        </w:rPr>
-        <w:t xml:space="preserve"> and disrupted demand conditions</w:t>
-      </w:r>
-      <w:r>
-        <w:rPr>
-          <w:rFonts w:ascii="Times New Roman" w:eastAsia="Times New Roman" w:hAnsi="Times New Roman" w:cs="Times New Roman"/>
-          <w:color w:val="000000"/>
-          <w:kern w:val="0"/>
-          <w:highlight w:val="yellow"/>
-          <w14:ligatures w14:val="none"/>
-        </w:rPr>
-        <w:t xml:space="preserve"> when model performance</w:t>
+        <w:t>across routine, traditional, and disrupted demand conditions when model performance</w:t>
       </w:r>
       <w:r>
         <w:rPr>
@@ -511,30 +421,10 @@
           <w:rFonts w:ascii="Times New Roman" w:eastAsia="Times New Roman" w:hAnsi="Times New Roman" w:cs="Times New Roman"/>
           <w:color w:val="000000"/>
           <w:kern w:val="0"/>
-          <w14:ligatures w14:val="none"/>
-        </w:rPr>
-        <w:t>Which predictive modeling frameworks are most effective for forecasting airport passenger flow when prioritizing robustness, resilience, or generalizability as the primary evaluation metric?</w:t>
-      </w:r>
-    </w:p>
-    <w:p>
-      <w:pPr>
-        <w:spacing w:after="0" w:line="480" w:lineRule="auto"/>
-        <w:rPr>
-          <w:rFonts w:ascii="Times New Roman" w:eastAsia="Times New Roman" w:hAnsi="Times New Roman" w:cs="Times New Roman"/>
-          <w:kern w:val="0"/>
-          <w14:ligatures w14:val="none"/>
-        </w:rPr>
-      </w:pPr>
-      <w:r>
-        <w:rPr>
-          <w:rFonts w:ascii="Times New Roman" w:eastAsia="Times New Roman" w:hAnsi="Times New Roman" w:cs="Times New Roman"/>
-          <w:b/>
-          <w:bCs/>
-          <w:color w:val="000000"/>
-          <w:kern w:val="0"/>
-          <w14:ligatures w14:val="none"/>
-        </w:rPr>
-        <w:t>Delimitations</w:t>
+          <w:shd w:val="clear" w:color="auto" w:fill="FFFF00"/>
+          <w14:ligatures w14:val="none"/>
+        </w:rPr>
+        <w:t>How do deterministic baseline models, supervised machine learning architectures, and dynamic hybrid models compare across steady-state accuracy (Robustness), disruption shock absorption (Resilience), and cross-terminal spatial transferability (Generalizability)?</w:t>
       </w:r>
     </w:p>
     <w:p>
@@ -543,7 +433,9 @@
         <w:ind w:firstLine="720"/>
         <w:rPr>
           <w:rFonts w:ascii="Times New Roman" w:eastAsia="Times New Roman" w:hAnsi="Times New Roman" w:cs="Times New Roman"/>
-          <w:kern w:val="0"/>
+          <w:color w:val="000000"/>
+          <w:kern w:val="0"/>
+          <w:shd w:val="clear" w:color="auto" w:fill="FFFF00"/>
           <w14:ligatures w14:val="none"/>
         </w:rPr>
       </w:pPr>
@@ -552,106 +444,10 @@
           <w:rFonts w:ascii="Times New Roman" w:eastAsia="Times New Roman" w:hAnsi="Times New Roman" w:cs="Times New Roman"/>
           <w:color w:val="000000"/>
           <w:kern w:val="0"/>
-          <w14:ligatures w14:val="none"/>
-        </w:rPr>
-        <w:t>This study focuses on U.S. airports and uses post-pandemic TSA throughput and flight performance data from 2019 to 2025. It excludes pre-pandemic and pandemic-period activity except where needed to define the post-pandemic baseline. Dynamic queuing models and simulation</w:t>
-      </w:r>
-      <w:r>
-        <w:rPr>
-          <w:rFonts w:ascii="Times New Roman" w:eastAsia="Times New Roman" w:hAnsi="Times New Roman" w:cs="Times New Roman"/>
-          <w:color w:val="000000"/>
-          <w:kern w:val="0"/>
-          <w14:ligatures w14:val="none"/>
-        </w:rPr>
-        <w:noBreakHyphen/>
-        <w:t>based methods are assessed using standard statistical measures, including p</w:t>
-      </w:r>
-      <w:r>
-        <w:rPr>
-          <w:rFonts w:ascii="Times New Roman" w:eastAsia="Times New Roman" w:hAnsi="Times New Roman" w:cs="Times New Roman"/>
-          <w:color w:val="000000"/>
-          <w:kern w:val="0"/>
-          <w14:ligatures w14:val="none"/>
-        </w:rPr>
-        <w:noBreakHyphen/>
-        <w:t>value, R</w:t>
-      </w:r>
-      <w:r>
-        <w:rPr>
-          <w:rFonts w:ascii="Times New Roman" w:eastAsia="Times New Roman" w:hAnsi="Times New Roman" w:cs="Times New Roman"/>
-          <w:color w:val="000000"/>
-          <w:kern w:val="0"/>
-          <w:vertAlign w:val="superscript"/>
-          <w14:ligatures w14:val="none"/>
-        </w:rPr>
-        <w:t>2</w:t>
-      </w:r>
-      <w:r>
-        <w:rPr>
-          <w:rFonts w:ascii="Times New Roman" w:eastAsia="Times New Roman" w:hAnsi="Times New Roman" w:cs="Times New Roman"/>
-          <w:color w:val="000000"/>
-          <w:kern w:val="0"/>
-          <w14:ligatures w14:val="none"/>
-        </w:rPr>
-        <w:t xml:space="preserve"> squared, mean squared error (MSE), </w:t>
-      </w:r>
-      <w:r>
-        <w:rPr>
-          <w:rFonts w:ascii="Times New Roman" w:eastAsia="Times New Roman" w:hAnsi="Times New Roman" w:cs="Times New Roman"/>
-          <w:color w:val="000000"/>
-          <w:kern w:val="0"/>
           <w:shd w:val="clear" w:color="auto" w:fill="FFFF00"/>
           <w14:ligatures w14:val="none"/>
         </w:rPr>
-        <w:t>root mean squared error (RMSE),</w:t>
-      </w:r>
-      <w:r>
-        <w:rPr>
-          <w:rFonts w:ascii="Times New Roman" w:eastAsia="Times New Roman" w:hAnsi="Times New Roman" w:cs="Times New Roman"/>
-          <w:color w:val="000000"/>
-          <w:kern w:val="0"/>
-          <w14:ligatures w14:val="none"/>
-        </w:rPr>
-        <w:t xml:space="preserve"> and mean absolute percentage error (MAPE).</w:t>
-      </w:r>
-    </w:p>
-    <w:p>
-      <w:pPr>
-        <w:spacing w:after="0" w:line="480" w:lineRule="auto"/>
-        <w:rPr>
-          <w:rFonts w:ascii="Times New Roman" w:eastAsia="Times New Roman" w:hAnsi="Times New Roman" w:cs="Times New Roman"/>
-          <w:kern w:val="0"/>
-          <w14:ligatures w14:val="none"/>
-        </w:rPr>
-      </w:pPr>
-      <w:r>
-        <w:rPr>
-          <w:rFonts w:ascii="Times New Roman" w:eastAsia="Times New Roman" w:hAnsi="Times New Roman" w:cs="Times New Roman"/>
-          <w:b/>
-          <w:bCs/>
-          <w:color w:val="000000"/>
-          <w:kern w:val="0"/>
-          <w14:ligatures w14:val="none"/>
-        </w:rPr>
-        <w:t xml:space="preserve">Limitations and Assumptions    </w:t>
-      </w:r>
-      <w:r>
-        <w:rPr>
-          <w:rFonts w:ascii="Times New Roman" w:eastAsia="Times New Roman" w:hAnsi="Times New Roman" w:cs="Times New Roman"/>
-          <w:color w:val="000000"/>
-          <w:kern w:val="0"/>
-          <w14:ligatures w14:val="none"/>
-        </w:rPr>
-        <w:t>  </w:t>
-      </w:r>
-      <w:r>
-        <w:rPr>
-          <w:rFonts w:ascii="Times New Roman" w:eastAsia="Times New Roman" w:hAnsi="Times New Roman" w:cs="Times New Roman"/>
-          <w:color w:val="000000"/>
-          <w:kern w:val="0"/>
-          <w14:ligatures w14:val="none"/>
-        </w:rPr>
-        <w:tab/>
+        <w:t>Hypothesis 1: Of the three different approaches to volatility forecast modeling (deterministic, probabilistic, and standard hybrid), no individual approach will prove superior across all three performance measures (resilience, robustness, and generalizability).</w:t>
       </w:r>
     </w:p>
     <w:p>
@@ -667,11 +463,91 @@
       <w:r>
         <w:rPr>
           <w:rFonts w:ascii="Times New Roman" w:eastAsia="Times New Roman" w:hAnsi="Times New Roman" w:cs="Times New Roman"/>
-          <w:color w:val="000000"/>
-          <w:kern w:val="0"/>
-          <w14:ligatures w14:val="none"/>
-        </w:rPr>
-        <w:t xml:space="preserve">Due to reliance on public data, confidential variables like staffing and manual queue management fall outside the scope of this analysis. While external factors such as weather, regulatory impacts, or IT outages may not be fully accounted for, the framework assumes that utilized data is consistent and findings from the selected airports are generalizable across similar </w:t>
+          <w:kern w:val="0"/>
+          <w:highlight w:val="yellow"/>
+          <w14:ligatures w14:val="none"/>
+        </w:rPr>
+        <w:t>Which predictive modeling frameworks are most effective for forecasting airport passenger security screening throughput when prioritizing robustness (routine operational accuracy), resilience (stability under convective weather and delay disruptions), or generalizability (cross-airport portability across terminal layouts) as the primary operational evaluation metric?</w:t>
+      </w:r>
+    </w:p>
+    <w:p>
+      <w:pPr>
+        <w:spacing w:after="0" w:line="480" w:lineRule="auto"/>
+        <w:rPr>
+          <w:rFonts w:ascii="Times New Roman" w:eastAsia="Times New Roman" w:hAnsi="Times New Roman" w:cs="Times New Roman"/>
+          <w:kern w:val="0"/>
+          <w14:ligatures w14:val="none"/>
+        </w:rPr>
+      </w:pPr>
+      <w:r>
+        <w:rPr>
+          <w:rFonts w:ascii="Times New Roman" w:eastAsia="Times New Roman" w:hAnsi="Times New Roman" w:cs="Times New Roman"/>
+          <w:b/>
+          <w:bCs/>
+          <w:color w:val="000000"/>
+          <w:kern w:val="0"/>
+          <w14:ligatures w14:val="none"/>
+        </w:rPr>
+        <w:t>Delimitations</w:t>
+      </w:r>
+    </w:p>
+    <w:p>
+      <w:pPr>
+        <w:spacing w:after="0" w:line="480" w:lineRule="auto"/>
+        <w:ind w:firstLine="720"/>
+        <w:rPr>
+          <w:rFonts w:ascii="Times New Roman" w:eastAsia="Times New Roman" w:hAnsi="Times New Roman" w:cs="Times New Roman"/>
+          <w:kern w:val="0"/>
+          <w14:ligatures w14:val="none"/>
+        </w:rPr>
+      </w:pPr>
+      <w:r>
+        <w:rPr>
+          <w:rFonts w:ascii="Times New Roman" w:eastAsia="Times New Roman" w:hAnsi="Times New Roman" w:cs="Times New Roman"/>
+          <w:color w:val="000000"/>
+          <w:kern w:val="0"/>
+          <w14:ligatures w14:val="none"/>
+        </w:rPr>
+        <w:t>This study focuses on U.S. airports and uses post-pandemic TSA throughput and flight performance data from 2019 to 2025. It excludes pre-pandemic and pandemic-period activity except where needed to define the post-pandemic baseline. Dynamic queuing models and simulation</w:t>
+      </w:r>
+      <w:r>
+        <w:rPr>
+          <w:rFonts w:ascii="Times New Roman" w:eastAsia="Times New Roman" w:hAnsi="Times New Roman" w:cs="Times New Roman"/>
+          <w:color w:val="000000"/>
+          <w:kern w:val="0"/>
+          <w14:ligatures w14:val="none"/>
+        </w:rPr>
+        <w:noBreakHyphen/>
+        <w:t>based methods are assessed using standard statistical measures, including p</w:t>
+      </w:r>
+      <w:r>
+        <w:rPr>
+          <w:rFonts w:ascii="Times New Roman" w:eastAsia="Times New Roman" w:hAnsi="Times New Roman" w:cs="Times New Roman"/>
+          <w:color w:val="000000"/>
+          <w:kern w:val="0"/>
+          <w14:ligatures w14:val="none"/>
+        </w:rPr>
+        <w:noBreakHyphen/>
+        <w:t>value, R</w:t>
+      </w:r>
+      <w:r>
+        <w:rPr>
+          <w:rFonts w:ascii="Times New Roman" w:eastAsia="Times New Roman" w:hAnsi="Times New Roman" w:cs="Times New Roman"/>
+          <w:color w:val="000000"/>
+          <w:kern w:val="0"/>
+          <w:vertAlign w:val="superscript"/>
+          <w14:ligatures w14:val="none"/>
+        </w:rPr>
+        <w:t>2</w:t>
+      </w:r>
+      <w:r>
+        <w:rPr>
+          <w:rFonts w:ascii="Times New Roman" w:eastAsia="Times New Roman" w:hAnsi="Times New Roman" w:cs="Times New Roman"/>
+          <w:color w:val="000000"/>
+          <w:kern w:val="0"/>
+          <w14:ligatures w14:val="none"/>
+        </w:rPr>
+        <w:t xml:space="preserve"> </w:t>
       </w:r>
       <w:r>
         <w:rPr>
@@ -681,7 +557,85 @@
           <w14:ligatures w14:val="none"/>
         </w:rPr>
         <w:lastRenderedPageBreak/>
-        <w:t xml:space="preserve">facilities and circumstances. Additionally, the methodology relies on the ability to apply monthly data on load factor to the prediction of TSA throughput on an hourly and seasonal level. </w:t>
+        <w:t xml:space="preserve">squared, mean squared error (MSE), </w:t>
+      </w:r>
+      <w:r>
+        <w:rPr>
+          <w:rFonts w:ascii="Times New Roman" w:eastAsia="Times New Roman" w:hAnsi="Times New Roman" w:cs="Times New Roman"/>
+          <w:color w:val="000000"/>
+          <w:kern w:val="0"/>
+          <w:shd w:val="clear" w:color="auto" w:fill="FFFF00"/>
+          <w14:ligatures w14:val="none"/>
+        </w:rPr>
+        <w:t>root mean squared error (RMSE),</w:t>
+      </w:r>
+      <w:r>
+        <w:rPr>
+          <w:rFonts w:ascii="Times New Roman" w:eastAsia="Times New Roman" w:hAnsi="Times New Roman" w:cs="Times New Roman"/>
+          <w:color w:val="000000"/>
+          <w:kern w:val="0"/>
+          <w14:ligatures w14:val="none"/>
+        </w:rPr>
+        <w:t xml:space="preserve"> and mean absolute percentage error (MAPE).</w:t>
+      </w:r>
+    </w:p>
+    <w:p>
+      <w:pPr>
+        <w:spacing w:after="0" w:line="480" w:lineRule="auto"/>
+        <w:rPr>
+          <w:rFonts w:ascii="Times New Roman" w:eastAsia="Times New Roman" w:hAnsi="Times New Roman" w:cs="Times New Roman"/>
+          <w:kern w:val="0"/>
+          <w14:ligatures w14:val="none"/>
+        </w:rPr>
+      </w:pPr>
+      <w:r>
+        <w:rPr>
+          <w:rFonts w:ascii="Times New Roman" w:eastAsia="Times New Roman" w:hAnsi="Times New Roman" w:cs="Times New Roman"/>
+          <w:b/>
+          <w:bCs/>
+          <w:color w:val="000000"/>
+          <w:kern w:val="0"/>
+          <w14:ligatures w14:val="none"/>
+        </w:rPr>
+        <w:t xml:space="preserve">Limitations and Assumptions    </w:t>
+      </w:r>
+      <w:r>
+        <w:rPr>
+          <w:rFonts w:ascii="Times New Roman" w:eastAsia="Times New Roman" w:hAnsi="Times New Roman" w:cs="Times New Roman"/>
+          <w:color w:val="000000"/>
+          <w:kern w:val="0"/>
+          <w14:ligatures w14:val="none"/>
+        </w:rPr>
+        <w:t>  </w:t>
+      </w:r>
+      <w:r>
+        <w:rPr>
+          <w:rFonts w:ascii="Times New Roman" w:eastAsia="Times New Roman" w:hAnsi="Times New Roman" w:cs="Times New Roman"/>
+          <w:color w:val="000000"/>
+          <w:kern w:val="0"/>
+          <w14:ligatures w14:val="none"/>
+        </w:rPr>
+        <w:tab/>
+      </w:r>
+    </w:p>
+    <w:p>
+      <w:pPr>
+        <w:spacing w:after="0" w:line="480" w:lineRule="auto"/>
+        <w:ind w:firstLine="720"/>
+        <w:rPr>
+          <w:rFonts w:ascii="Times New Roman" w:eastAsia="Times New Roman" w:hAnsi="Times New Roman" w:cs="Times New Roman"/>
+          <w:kern w:val="0"/>
+          <w14:ligatures w14:val="none"/>
+        </w:rPr>
+      </w:pPr>
+      <w:r>
+        <w:rPr>
+          <w:rFonts w:ascii="Times New Roman" w:eastAsia="Times New Roman" w:hAnsi="Times New Roman" w:cs="Times New Roman"/>
+          <w:color w:val="000000"/>
+          <w:kern w:val="0"/>
+          <w14:ligatures w14:val="none"/>
+        </w:rPr>
+        <w:t xml:space="preserve">Due to reliance on public data, confidential variables like staffing and manual queue management fall outside the scope of this analysis. While external factors such as weather, regulatory impacts, or IT outages may not be fully accounted for, the framework assumes that utilized data is consistent and findings from the selected airports are generalizable across similar facilities and circumstances. Additionally, the methodology relies on the ability to apply monthly data on load factor to the prediction of TSA throughput on an hourly and seasonal level. </w:t>
       </w:r>
     </w:p>
     <w:p>

</xml_diff>